<commit_message>
Completed Week 7 Activities
</commit_message>
<xml_diff>
--- a/week 7/Stage_4_SmartCare_v04_Domain_Implementation_Workbook.docx
+++ b/week 7/Stage_4_SmartCare_v04_Domain_Implementation_Workbook.docx
@@ -169,10 +169,7 @@
           </w:tcPr>
           <w:p>
             <w:r>
-              <w:t>I</w:t>
-            </w:r>
-            <w:r>
-              <w:t>dentifier, name and specialty</w:t>
+              <w:t>Identifier, name and specialty</w:t>
             </w:r>
           </w:p>
         </w:tc>
@@ -214,10 +211,7 @@
           </w:tcPr>
           <w:p>
             <w:r>
-              <w:t>A</w:t>
-            </w:r>
-            <w:r>
-              <w:t>ppointment behaviour and control valid status transitions</w:t>
+              <w:t>Appointment behaviour and control valid status transitions</w:t>
             </w:r>
           </w:p>
         </w:tc>
@@ -259,10 +253,7 @@
           </w:tcPr>
           <w:p>
             <w:r>
-              <w:t>R</w:t>
-            </w:r>
-            <w:r>
-              <w:t>epresent appointment states and prevent uncontrolled status values</w:t>
+              <w:t>Represent appointment states and prevent uncontrolled status values</w:t>
             </w:r>
           </w:p>
         </w:tc>
@@ -302,7 +293,14 @@
           <w:tcPr>
             <w:tcW w:w="3735" w:type="dxa"/>
           </w:tcPr>
-          <w:p/>
+          <w:p>
+            <w:r>
+              <w:t xml:space="preserve">Patient name is stored </w:t>
+            </w:r>
+            <w:r>
+              <w:t>in appointment</w:t>
+            </w:r>
+          </w:p>
         </w:tc>
       </w:tr>
       <w:tr>
@@ -340,7 +338,11 @@
           <w:tcPr>
             <w:tcW w:w="3735" w:type="dxa"/>
           </w:tcPr>
-          <w:p/>
+          <w:p>
+            <w:r>
+              <w:t>Practitioner name is stored in appointment</w:t>
+            </w:r>
+          </w:p>
         </w:tc>
       </w:tr>
     </w:tbl>
@@ -359,14 +361,14 @@
         <w:tblLook w:val="04A0" w:firstRow="1" w:lastRow="0" w:firstColumn="1" w:lastColumn="0" w:noHBand="0" w:noVBand="1"/>
       </w:tblPr>
       <w:tblGrid>
-        <w:gridCol w:w="2518"/>
-        <w:gridCol w:w="3544"/>
-        <w:gridCol w:w="4018"/>
+        <w:gridCol w:w="1668"/>
+        <w:gridCol w:w="4252"/>
+        <w:gridCol w:w="4160"/>
       </w:tblGrid>
       <w:tr>
         <w:tc>
           <w:tcPr>
-            <w:tcW w:w="2518" w:type="dxa"/>
+            <w:tcW w:w="1668" w:type="dxa"/>
           </w:tcPr>
           <w:p>
             <w:r>
@@ -376,7 +378,7 @@
         </w:tc>
         <w:tc>
           <w:tcPr>
-            <w:tcW w:w="3544" w:type="dxa"/>
+            <w:tcW w:w="4252" w:type="dxa"/>
           </w:tcPr>
           <w:p>
             <w:r>
@@ -386,7 +388,7 @@
         </w:tc>
         <w:tc>
           <w:tcPr>
-            <w:tcW w:w="4018" w:type="dxa"/>
+            <w:tcW w:w="4160" w:type="dxa"/>
           </w:tcPr>
           <w:p>
             <w:r>
@@ -398,7 +400,7 @@
       <w:tr>
         <w:tc>
           <w:tcPr>
-            <w:tcW w:w="2518" w:type="dxa"/>
+            <w:tcW w:w="1668" w:type="dxa"/>
           </w:tcPr>
           <w:p>
             <w:r>
@@ -408,17 +410,20 @@
         </w:tc>
         <w:tc>
           <w:tcPr>
-            <w:tcW w:w="3544" w:type="dxa"/>
+            <w:tcW w:w="4252" w:type="dxa"/>
           </w:tcPr>
           <w:p>
             <w:r>
-              <w:t>Patient name must be valid</w:t>
+              <w:t xml:space="preserve">Patient name must </w:t>
+            </w:r>
+            <w:r>
+              <w:t>not be empty</w:t>
             </w:r>
           </w:p>
         </w:tc>
         <w:tc>
           <w:tcPr>
-            <w:tcW w:w="4018" w:type="dxa"/>
+            <w:tcW w:w="4160" w:type="dxa"/>
           </w:tcPr>
           <w:p>
             <w:r>
@@ -430,7 +435,7 @@
       <w:tr>
         <w:tc>
           <w:tcPr>
-            <w:tcW w:w="2518" w:type="dxa"/>
+            <w:tcW w:w="1668" w:type="dxa"/>
           </w:tcPr>
           <w:p>
             <w:r>
@@ -440,21 +445,24 @@
         </w:tc>
         <w:tc>
           <w:tcPr>
-            <w:tcW w:w="3544" w:type="dxa"/>
+            <w:tcW w:w="4252" w:type="dxa"/>
           </w:tcPr>
           <w:p>
             <w:r>
-              <w:t>Identifier, name, and speciality must contain valid values.</w:t>
+              <w:t xml:space="preserve">Identifier, name, and speciality must </w:t>
+            </w:r>
+            <w:r>
+              <w:t>not be empty</w:t>
             </w:r>
           </w:p>
         </w:tc>
         <w:tc>
           <w:tcPr>
-            <w:tcW w:w="4018" w:type="dxa"/>
+            <w:tcW w:w="4160" w:type="dxa"/>
           </w:tcPr>
           <w:p>
             <w:r>
-              <w:t>Validate required values during object creation rather than allowing invalid state</w:t>
+              <w:t>Validate required values during object creation</w:t>
             </w:r>
           </w:p>
         </w:tc>
@@ -462,7 +470,7 @@
       <w:tr>
         <w:tc>
           <w:tcPr>
-            <w:tcW w:w="2518" w:type="dxa"/>
+            <w:tcW w:w="1668" w:type="dxa"/>
           </w:tcPr>
           <w:p>
             <w:r>
@@ -472,20 +480,17 @@
         </w:tc>
         <w:tc>
           <w:tcPr>
-            <w:tcW w:w="3544" w:type="dxa"/>
+            <w:tcW w:w="4252" w:type="dxa"/>
           </w:tcPr>
           <w:p>
             <w:r>
-              <w:t>S</w:t>
-            </w:r>
-            <w:r>
-              <w:t>tatus can only change through permitted transitions</w:t>
+              <w:t>Status can only change through permitted transitions</w:t>
             </w:r>
           </w:p>
         </w:tc>
         <w:tc>
           <w:tcPr>
-            <w:tcW w:w="4018" w:type="dxa"/>
+            <w:tcW w:w="4160" w:type="dxa"/>
           </w:tcPr>
           <w:p>
             <w:r>
@@ -497,7 +502,7 @@
       <w:tr>
         <w:tc>
           <w:tcPr>
-            <w:tcW w:w="2518" w:type="dxa"/>
+            <w:tcW w:w="1668" w:type="dxa"/>
           </w:tcPr>
           <w:p>
             <w:r>
@@ -507,7 +512,7 @@
         </w:tc>
         <w:tc>
           <w:tcPr>
-            <w:tcW w:w="3544" w:type="dxa"/>
+            <w:tcW w:w="4252" w:type="dxa"/>
           </w:tcPr>
           <w:p>
             <w:r>
@@ -517,7 +522,7 @@
         </w:tc>
         <w:tc>
           <w:tcPr>
-            <w:tcW w:w="4018" w:type="dxa"/>
+            <w:tcW w:w="4160" w:type="dxa"/>
           </w:tcPr>
           <w:p>
             <w:r>
@@ -804,13 +809,7 @@
         <w:pStyle w:val="Heading1"/>
       </w:pPr>
       <w:r>
-        <w:t>4. AI Pair-P</w:t>
-      </w:r>
-      <w:r>
-        <w:t>s</w:t>
-      </w:r>
-      <w:r>
-        <w:t>rogramming Record</w:t>
+        <w:t>4. AI Pair-Programming Record</w:t>
       </w:r>
     </w:p>
     <w:tbl>
@@ -820,16 +819,16 @@
         <w:tblLook w:val="04A0" w:firstRow="1" w:lastRow="0" w:firstColumn="1" w:lastColumn="0" w:noHBand="0" w:noVBand="1"/>
       </w:tblPr>
       <w:tblGrid>
-        <w:gridCol w:w="2016"/>
-        <w:gridCol w:w="2016"/>
-        <w:gridCol w:w="2016"/>
-        <w:gridCol w:w="2016"/>
-        <w:gridCol w:w="2016"/>
+        <w:gridCol w:w="2857"/>
+        <w:gridCol w:w="1229"/>
+        <w:gridCol w:w="1426"/>
+        <w:gridCol w:w="2319"/>
+        <w:gridCol w:w="2465"/>
       </w:tblGrid>
       <w:tr>
         <w:tc>
           <w:tcPr>
-            <w:tcW w:w="2016" w:type="dxa"/>
+            <w:tcW w:w="2948" w:type="dxa"/>
           </w:tcPr>
           <w:p>
             <w:r>
@@ -839,7 +838,7 @@
         </w:tc>
         <w:tc>
           <w:tcPr>
-            <w:tcW w:w="2016" w:type="dxa"/>
+            <w:tcW w:w="1129" w:type="dxa"/>
           </w:tcPr>
           <w:p>
             <w:r>
@@ -849,7 +848,7 @@
         </w:tc>
         <w:tc>
           <w:tcPr>
-            <w:tcW w:w="2016" w:type="dxa"/>
+            <w:tcW w:w="1461" w:type="dxa"/>
           </w:tcPr>
           <w:p>
             <w:r>
@@ -859,7 +858,7 @@
         </w:tc>
         <w:tc>
           <w:tcPr>
-            <w:tcW w:w="2016" w:type="dxa"/>
+            <w:tcW w:w="2216" w:type="dxa"/>
           </w:tcPr>
           <w:p>
             <w:r>
@@ -869,7 +868,7 @@
         </w:tc>
         <w:tc>
           <w:tcPr>
-            <w:tcW w:w="2016" w:type="dxa"/>
+            <w:tcW w:w="2542" w:type="dxa"/>
           </w:tcPr>
           <w:p>
             <w:r>
@@ -881,161 +880,280 @@
       <w:tr>
         <w:tc>
           <w:tcPr>
-            <w:tcW w:w="2016" w:type="dxa"/>
+            <w:tcW w:w="2948" w:type="dxa"/>
           </w:tcPr>
-          <w:p/>
+          <w:p>
+            <w:r>
+              <w:lastRenderedPageBreak/>
+              <w:t>U</w:t>
+            </w:r>
+            <w:r>
+              <w:t>sing an AppointmentStatus enum with SCHEDULED, COMPLETED, and CANCELLE</w:t>
+            </w:r>
+            <w:r>
+              <w:t>D</w:t>
+            </w:r>
+          </w:p>
         </w:tc>
         <w:tc>
           <w:tcPr>
-            <w:tcW w:w="2016" w:type="dxa"/>
+            <w:tcW w:w="1129" w:type="dxa"/>
           </w:tcPr>
-          <w:p/>
+          <w:p>
+            <w:r>
+              <w:t>Yes</w:t>
+            </w:r>
+          </w:p>
         </w:tc>
         <w:tc>
           <w:tcPr>
-            <w:tcW w:w="2016" w:type="dxa"/>
+            <w:tcW w:w="1461" w:type="dxa"/>
           </w:tcPr>
-          <w:p/>
+          <w:p>
+            <w:r>
+              <w:t>Accepted</w:t>
+            </w:r>
+          </w:p>
         </w:tc>
         <w:tc>
           <w:tcPr>
-            <w:tcW w:w="2016" w:type="dxa"/>
+            <w:tcW w:w="2216" w:type="dxa"/>
           </w:tcPr>
-          <w:p/>
+          <w:p>
+            <w:r>
+              <w:t>The task required an `AppointmentStatus` enum</w:t>
+            </w:r>
+          </w:p>
         </w:tc>
         <w:tc>
           <w:tcPr>
-            <w:tcW w:w="2016" w:type="dxa"/>
+            <w:tcW w:w="2542" w:type="dxa"/>
           </w:tcPr>
-          <w:p/>
+          <w:p>
+            <w:r>
+              <w:t>Checked against the task instruction requiring an enum for appointment status</w:t>
+            </w:r>
+          </w:p>
         </w:tc>
       </w:tr>
       <w:tr>
         <w:tc>
           <w:tcPr>
-            <w:tcW w:w="2016" w:type="dxa"/>
+            <w:tcW w:w="2948" w:type="dxa"/>
           </w:tcPr>
-          <w:p/>
+          <w:p>
+            <w:r>
+              <w:t>S</w:t>
+            </w:r>
+            <w:r>
+              <w:t>etting new appointments to SCHEDULED by default</w:t>
+            </w:r>
+          </w:p>
         </w:tc>
         <w:tc>
           <w:tcPr>
-            <w:tcW w:w="2016" w:type="dxa"/>
+            <w:tcW w:w="1129" w:type="dxa"/>
           </w:tcPr>
-          <w:p/>
+          <w:p>
+            <w:r>
+              <w:t>Partial</w:t>
+            </w:r>
+          </w:p>
         </w:tc>
         <w:tc>
           <w:tcPr>
-            <w:tcW w:w="2016" w:type="dxa"/>
+            <w:tcW w:w="1461" w:type="dxa"/>
           </w:tcPr>
-          <w:p/>
+          <w:p>
+            <w:r>
+              <w:t>Accepted</w:t>
+            </w:r>
+          </w:p>
         </w:tc>
         <w:tc>
           <w:tcPr>
-            <w:tcW w:w="2016" w:type="dxa"/>
+            <w:tcW w:w="2216" w:type="dxa"/>
           </w:tcPr>
-          <w:p/>
+          <w:p>
+            <w:r>
+              <w:t>The UML includes a status field but does not specify the initial status</w:t>
+            </w:r>
+          </w:p>
         </w:tc>
         <w:tc>
           <w:tcPr>
-            <w:tcW w:w="2016" w:type="dxa"/>
+            <w:tcW w:w="2542" w:type="dxa"/>
           </w:tcPr>
-          <w:p/>
+          <w:p>
+            <w:r>
+              <w:t>Identified as an implementation assumption because the initial status is not shown in the UML</w:t>
+            </w:r>
+          </w:p>
         </w:tc>
       </w:tr>
       <w:tr>
         <w:tc>
           <w:tcPr>
-            <w:tcW w:w="2016" w:type="dxa"/>
+            <w:tcW w:w="2948" w:type="dxa"/>
           </w:tcPr>
-          <w:p/>
+          <w:p>
+            <w:r>
+              <w:t xml:space="preserve">Not </w:t>
+            </w:r>
+            <w:r>
+              <w:t>using setters in __init__() for validation</w:t>
+            </w:r>
+          </w:p>
         </w:tc>
         <w:tc>
           <w:tcPr>
-            <w:tcW w:w="2016" w:type="dxa"/>
+            <w:tcW w:w="1129" w:type="dxa"/>
           </w:tcPr>
-          <w:p/>
+          <w:p>
+            <w:r>
+              <w:t>No</w:t>
+            </w:r>
+          </w:p>
         </w:tc>
         <w:tc>
           <w:tcPr>
-            <w:tcW w:w="2016" w:type="dxa"/>
+            <w:tcW w:w="1461" w:type="dxa"/>
           </w:tcPr>
-          <w:p/>
+          <w:p>
+            <w:r>
+              <w:t>Modified</w:t>
+            </w:r>
+          </w:p>
         </w:tc>
         <w:tc>
           <w:tcPr>
-            <w:tcW w:w="2016" w:type="dxa"/>
+            <w:tcW w:w="2216" w:type="dxa"/>
           </w:tcPr>
-          <w:p/>
+          <w:p>
+            <w:r>
+              <w:t>Does not follow the standards/conventions used on existing classes</w:t>
+            </w:r>
+          </w:p>
         </w:tc>
         <w:tc>
           <w:tcPr>
-            <w:tcW w:w="2016" w:type="dxa"/>
+            <w:tcW w:w="2542" w:type="dxa"/>
           </w:tcPr>
-          <w:p/>
+          <w:p>
+            <w:r>
+              <w:t>Compared with the existing Patient implementation, which calls set_name() from __init__()</w:t>
+            </w:r>
+          </w:p>
         </w:tc>
       </w:tr>
       <w:tr>
         <w:tc>
           <w:tcPr>
-            <w:tcW w:w="2016" w:type="dxa"/>
+            <w:tcW w:w="2948" w:type="dxa"/>
           </w:tcPr>
-          <w:p/>
+          <w:p>
+            <w:r>
+              <w:t>G</w:t>
+            </w:r>
+            <w:r>
+              <w:t>enerating appointment IDs automatically</w:t>
+            </w:r>
+          </w:p>
         </w:tc>
         <w:tc>
           <w:tcPr>
-            <w:tcW w:w="2016" w:type="dxa"/>
+            <w:tcW w:w="1129" w:type="dxa"/>
           </w:tcPr>
-          <w:p/>
+          <w:p>
+            <w:r>
+              <w:t>No</w:t>
+            </w:r>
+          </w:p>
         </w:tc>
         <w:tc>
           <w:tcPr>
-            <w:tcW w:w="2016" w:type="dxa"/>
+            <w:tcW w:w="1461" w:type="dxa"/>
           </w:tcPr>
-          <w:p/>
+          <w:p>
+            <w:r>
+              <w:t>Rejected</w:t>
+            </w:r>
+          </w:p>
         </w:tc>
         <w:tc>
           <w:tcPr>
-            <w:tcW w:w="2016" w:type="dxa"/>
+            <w:tcW w:w="2216" w:type="dxa"/>
           </w:tcPr>
-          <w:p/>
+          <w:p>
+            <w:r>
+              <w:t>The UML shows an appointment ID but does not explain how it is generated</w:t>
+            </w:r>
+          </w:p>
         </w:tc>
         <w:tc>
           <w:tcPr>
-            <w:tcW w:w="2016" w:type="dxa"/>
+            <w:tcW w:w="2542" w:type="dxa"/>
           </w:tcPr>
-          <w:p/>
+          <w:p>
+            <w:r>
+              <w:t>Checked the UML constructor and task instructions; no ID-generation rule or database logic is provided</w:t>
+            </w:r>
+          </w:p>
         </w:tc>
       </w:tr>
       <w:tr>
         <w:tc>
           <w:tcPr>
-            <w:tcW w:w="2016" w:type="dxa"/>
+            <w:tcW w:w="2948" w:type="dxa"/>
           </w:tcPr>
-          <w:p/>
+          <w:p>
+            <w:r>
+              <w:t>A</w:t>
+            </w:r>
+            <w:r>
+              <w:t>dding database, repository, UI, notification, or service logic</w:t>
+            </w:r>
+          </w:p>
         </w:tc>
         <w:tc>
           <w:tcPr>
-            <w:tcW w:w="2016" w:type="dxa"/>
+            <w:tcW w:w="1129" w:type="dxa"/>
           </w:tcPr>
-          <w:p/>
+          <w:p>
+            <w:r>
+              <w:t>No</w:t>
+            </w:r>
+          </w:p>
         </w:tc>
         <w:tc>
           <w:tcPr>
-            <w:tcW w:w="2016" w:type="dxa"/>
+            <w:tcW w:w="1461" w:type="dxa"/>
           </w:tcPr>
-          <w:p/>
+          <w:p>
+            <w:r>
+              <w:t>Rejected</w:t>
+            </w:r>
+          </w:p>
         </w:tc>
         <w:tc>
           <w:tcPr>
-            <w:tcW w:w="2016" w:type="dxa"/>
+            <w:tcW w:w="2216" w:type="dxa"/>
           </w:tcPr>
-          <w:p/>
+          <w:p>
+            <w:r>
+              <w:t>These features are outside the scope of the task</w:t>
+            </w:r>
+          </w:p>
         </w:tc>
         <w:tc>
           <w:tcPr>
-            <w:tcW w:w="2016" w:type="dxa"/>
+            <w:tcW w:w="2542" w:type="dxa"/>
           </w:tcPr>
-          <w:p/>
+          <w:p>
+            <w:r>
+              <w:t>Checked against the explicit instruction not to add database, UI, notification, or service classes</w:t>
+            </w:r>
+          </w:p>
         </w:tc>
       </w:tr>
     </w:tbl>
@@ -1050,6 +1168,63 @@
     <w:p>
       <w:r>
         <w:t>Insert updated UML only if implementation revealed a justified design change. Explain every change.</w:t>
+      </w:r>
+    </w:p>
+    <w:p/>
+    <w:p>
+      <w:r>
+        <w:rPr>
+          <w:noProof/>
+        </w:rPr>
+        <w:lastRenderedPageBreak/>
+        <w:drawing>
+          <wp:inline distT="0" distB="0" distL="0" distR="0" wp14:anchorId="6A4499D1" wp14:editId="473893A7">
+            <wp:extent cx="6400800" cy="5314950"/>
+            <wp:effectExtent l="0" t="0" r="0" b="0"/>
+            <wp:docPr id="1539225632" name="Picture 1"/>
+            <wp:cNvGraphicFramePr>
+              <a:graphicFrameLocks xmlns:a="http://schemas.openxmlformats.org/drawingml/2006/main" noChangeAspect="1"/>
+            </wp:cNvGraphicFramePr>
+            <a:graphic xmlns:a="http://schemas.openxmlformats.org/drawingml/2006/main">
+              <a:graphicData uri="http://schemas.openxmlformats.org/drawingml/2006/picture">
+                <pic:pic xmlns:pic="http://schemas.openxmlformats.org/drawingml/2006/picture">
+                  <pic:nvPicPr>
+                    <pic:cNvPr id="0" name="Picture 1"/>
+                    <pic:cNvPicPr>
+                      <a:picLocks noChangeAspect="1" noChangeArrowheads="1"/>
+                    </pic:cNvPicPr>
+                  </pic:nvPicPr>
+                  <pic:blipFill>
+                    <a:blip r:embed="rId6">
+                      <a:extLst>
+                        <a:ext uri="{28A0092B-C50C-407E-A947-70E740481C1C}">
+                          <a14:useLocalDpi xmlns:a14="http://schemas.microsoft.com/office/drawing/2010/main" val="0"/>
+                        </a:ext>
+                      </a:extLst>
+                    </a:blip>
+                    <a:srcRect/>
+                    <a:stretch>
+                      <a:fillRect/>
+                    </a:stretch>
+                  </pic:blipFill>
+                  <pic:spPr bwMode="auto">
+                    <a:xfrm>
+                      <a:off x="0" y="0"/>
+                      <a:ext cx="6400800" cy="5314950"/>
+                    </a:xfrm>
+                    <a:prstGeom prst="rect">
+                      <a:avLst/>
+                    </a:prstGeom>
+                    <a:noFill/>
+                    <a:ln>
+                      <a:noFill/>
+                    </a:ln>
+                  </pic:spPr>
+                </pic:pic>
+              </a:graphicData>
+            </a:graphic>
+          </wp:inline>
+        </w:drawing>
       </w:r>
     </w:p>
     <w:sectPr>

</xml_diff>